<commit_message>
Corrected all arpeggios except for 3 extra notes being played
</commit_message>
<xml_diff>
--- a/Docs/Acknowledgements.docx
+++ b/Docs/Acknowledgements.docx
@@ -384,10 +384,10 @@
         <w:rPr>
           <w:u w:val="single"/>
         </w:rPr>
-        <w:t>Stop/Start</w:t>
-      </w:r>
-      <w:r>
-        <w:t xml:space="preserve"> – now you can pick any note, see it displayed on a staff</w:t>
+        <w:t>Play-Stop</w:t>
+      </w:r>
+      <w:r>
+        <w:t xml:space="preserve"> –pick any note, see it displayed on a staff</w:t>
       </w:r>
       <w:r>
         <w:t xml:space="preserve"> (with the key of C major), start and stop it playing when you wish.</w:t>
@@ -493,7 +493,27 @@
           <w:i/>
           <w:iCs/>
         </w:rPr>
-        <w:t xml:space="preserve">Yes. Just scroll down on the Music page. The Key picker is for the key of the music (not the key of the instrument). </w:t>
+        <w:t xml:space="preserve">Yes. Just scroll down </w:t>
+      </w:r>
+      <w:r>
+        <w:rPr>
+          <w:rStyle w:val="Style1Char"/>
+          <w:b w:val="0"/>
+          <w:bCs w:val="0"/>
+          <w:i/>
+          <w:iCs/>
+        </w:rPr>
+        <w:t>to the botom row on</w:t>
+      </w:r>
+      <w:r>
+        <w:rPr>
+          <w:rStyle w:val="Style1Char"/>
+          <w:b w:val="0"/>
+          <w:bCs w:val="0"/>
+          <w:i/>
+          <w:iCs/>
+        </w:rPr>
+        <w:t xml:space="preserve"> the Music page. The Key picker is for the key of the music (not the key of the instrument). </w:t>
       </w:r>
     </w:p>
     <w:p>
@@ -532,7 +552,7 @@
         <w:t>Feature:</w:t>
       </w:r>
       <w:r>
-        <w:t xml:space="preserve"> What to Play / now, when you make a selection on this page it instantly </w:t>
+        <w:t xml:space="preserve"> What to Play /  when you make a selection on this page it instantly </w:t>
       </w:r>
       <w:r>
         <w:t>take</w:t>
@@ -541,7 +561,10 @@
         <w:t>s</w:t>
       </w:r>
       <w:r>
-        <w:t xml:space="preserve"> you to the Music page and it will be listening for the first note.</w:t>
+        <w:t xml:space="preserve"> you to the Music page</w:t>
+      </w:r>
+      <w:r>
+        <w:t>.</w:t>
       </w:r>
       <w:r>
         <w:t xml:space="preserve"> </w:t>
@@ -562,7 +585,19 @@
         <w:t>Feature</w:t>
       </w:r>
       <w:r>
-        <w:t>: Settings / Action Switches / Listening starts when music appears. With this ON the back arrow on the “what to play” page will take you to the Music page and it will be listening for the first note.</w:t>
+        <w:t xml:space="preserve">: Settings / Action Switches / Listening starts when music appears. With this ON </w:t>
+      </w:r>
+      <w:r>
+        <w:t xml:space="preserve">whenever the </w:t>
+      </w:r>
+      <w:r>
+        <w:t xml:space="preserve">Music page </w:t>
+      </w:r>
+      <w:r>
+        <w:t xml:space="preserve">appears </w:t>
+      </w:r>
+      <w:r>
+        <w:t xml:space="preserve"> it will be listening for the first note.</w:t>
       </w:r>
     </w:p>
     <w:p>
@@ -661,6 +696,9 @@
       <w:r>
         <w:t xml:space="preserve"> </w:t>
       </w:r>
+      <w:r>
+        <w:t>The Tuner page now has a Metronome. Its tempo is independent of the tempo of the Music</w:t>
+      </w:r>
     </w:p>
     <w:p>
       <w:pPr>
@@ -668,6 +706,185 @@
       </w:pPr>
       <w:r>
         <w:t>Cat  Delaney</w:t>
+      </w:r>
+    </w:p>
+    <w:p>
+      <w:pPr>
+        <w:pStyle w:val="Style1"/>
+      </w:pPr>
+      <w:r>
+        <w:t xml:space="preserve">Comment: </w:t>
+      </w:r>
+      <w:r>
+        <w:rPr>
+          <w:b w:val="0"/>
+          <w:bCs w:val="0"/>
+        </w:rPr>
+        <w:t>Could an interval ear training tool be added</w:t>
+      </w:r>
+    </w:p>
+    <w:p>
+      <w:pPr>
+        <w:pStyle w:val="Style1"/>
+        <w:numPr>
+          <w:ilvl w:val="2"/>
+          <w:numId w:val="2"/>
+        </w:numPr>
+        <w:rPr>
+          <w:b w:val="0"/>
+          <w:bCs w:val="0"/>
+        </w:rPr>
+      </w:pPr>
+      <w:r>
+        <w:t>Feature:</w:t>
+      </w:r>
+      <w:r>
+        <w:rPr>
+          <w:b w:val="0"/>
+          <w:bCs w:val="0"/>
+        </w:rPr>
+        <w:t xml:space="preserve"> Interval Ear Training – On this new page you can</w:t>
+      </w:r>
+    </w:p>
+    <w:p>
+      <w:pPr>
+        <w:pStyle w:val="Style1"/>
+        <w:numPr>
+          <w:ilvl w:val="3"/>
+          <w:numId w:val="2"/>
+        </w:numPr>
+        <w:rPr>
+          <w:b w:val="0"/>
+          <w:bCs w:val="0"/>
+        </w:rPr>
+      </w:pPr>
+      <w:r>
+        <w:rPr>
+          <w:b w:val="0"/>
+          <w:bCs w:val="0"/>
+        </w:rPr>
+        <w:t>Select the</w:t>
+      </w:r>
+      <w:r>
+        <w:rPr>
+          <w:b w:val="0"/>
+          <w:bCs w:val="0"/>
+        </w:rPr>
+        <w:t xml:space="preserve"> first note or let it be random</w:t>
+      </w:r>
+    </w:p>
+    <w:p>
+      <w:pPr>
+        <w:pStyle w:val="Style1"/>
+        <w:numPr>
+          <w:ilvl w:val="3"/>
+          <w:numId w:val="2"/>
+        </w:numPr>
+        <w:rPr>
+          <w:b w:val="0"/>
+          <w:bCs w:val="0"/>
+        </w:rPr>
+      </w:pPr>
+      <w:r>
+        <w:rPr>
+          <w:b w:val="0"/>
+          <w:bCs w:val="0"/>
+        </w:rPr>
+        <w:t>Select ascending or desce</w:t>
+      </w:r>
+      <w:r>
+        <w:rPr>
+          <w:b w:val="0"/>
+          <w:bCs w:val="0"/>
+        </w:rPr>
+        <w:t>n</w:t>
+      </w:r>
+      <w:r>
+        <w:rPr>
+          <w:b w:val="0"/>
+          <w:bCs w:val="0"/>
+        </w:rPr>
+        <w:t>ding</w:t>
+      </w:r>
+    </w:p>
+    <w:p>
+      <w:pPr>
+        <w:pStyle w:val="Style1"/>
+        <w:numPr>
+          <w:ilvl w:val="3"/>
+          <w:numId w:val="2"/>
+        </w:numPr>
+        <w:rPr>
+          <w:b w:val="0"/>
+          <w:bCs w:val="0"/>
+        </w:rPr>
+      </w:pPr>
+      <w:r>
+        <w:rPr>
+          <w:b w:val="0"/>
+          <w:bCs w:val="0"/>
+        </w:rPr>
+        <w:t>Play an interval with a random second note.</w:t>
+      </w:r>
+    </w:p>
+    <w:p>
+      <w:pPr>
+        <w:pStyle w:val="Style1"/>
+        <w:numPr>
+          <w:ilvl w:val="3"/>
+          <w:numId w:val="2"/>
+        </w:numPr>
+        <w:rPr>
+          <w:b w:val="0"/>
+          <w:bCs w:val="0"/>
+        </w:rPr>
+      </w:pPr>
+      <w:r>
+        <w:rPr>
+          <w:b w:val="0"/>
+          <w:bCs w:val="0"/>
+        </w:rPr>
+        <w:t>OR play the previous interval again</w:t>
+      </w:r>
+    </w:p>
+    <w:p>
+      <w:pPr>
+        <w:pStyle w:val="Style1"/>
+        <w:numPr>
+          <w:ilvl w:val="3"/>
+          <w:numId w:val="2"/>
+        </w:numPr>
+        <w:rPr>
+          <w:b w:val="0"/>
+          <w:bCs w:val="0"/>
+        </w:rPr>
+      </w:pPr>
+      <w:r>
+        <w:rPr>
+          <w:b w:val="0"/>
+          <w:bCs w:val="0"/>
+        </w:rPr>
+        <w:t>After you have heard the interval you estimate what the interval was and tap the corresponding button.</w:t>
+      </w:r>
+    </w:p>
+    <w:p>
+      <w:pPr>
+        <w:pStyle w:val="Style1"/>
+        <w:numPr>
+          <w:ilvl w:val="3"/>
+          <w:numId w:val="2"/>
+        </w:numPr>
+        <w:rPr>
+          <w:b w:val="0"/>
+          <w:bCs w:val="0"/>
+        </w:rPr>
+      </w:pPr>
+      <w:r>
+        <w:rPr>
+          <w:b w:val="0"/>
+          <w:bCs w:val="0"/>
+        </w:rPr>
+        <w:t xml:space="preserve">If you are right  </w:t>
       </w:r>
     </w:p>
     <w:sectPr>

</xml_diff>

<commit_message>
Just started making it recognize when notes are played too quickly.
</commit_message>
<xml_diff>
--- a/Docs/Acknowledgements.docx
+++ b/Docs/Acknowledgements.docx
@@ -860,11 +860,29 @@
         </w:rPr>
       </w:pPr>
       <w:r>
-        <w:rPr>
-          <w:b w:val="0"/>
-          <w:bCs w:val="0"/>
-        </w:rPr>
-        <w:t>After you have heard the interval you estimate what the interval was and tap the corresponding button.</w:t>
+        <w:t xml:space="preserve">After you have heard the interval you estimate what the interval was </w:t>
+      </w:r>
+      <w:r>
+        <w:t>by</w:t>
+      </w:r>
+      <w:r>
+        <w:t xml:space="preserve"> tap</w:t>
+      </w:r>
+      <w:r>
+        <w:t>ping</w:t>
+      </w:r>
+      <w:r>
+        <w:t xml:space="preserve"> </w:t>
+      </w:r>
+      <w:r>
+        <w:t>a button</w:t>
+      </w:r>
+      <w:r>
+        <w:rPr>
+          <w:b w:val="0"/>
+          <w:bCs w:val="0"/>
+        </w:rPr>
+        <w:t>.</w:t>
       </w:r>
     </w:p>
     <w:p>
@@ -884,7 +902,788 @@
           <w:b w:val="0"/>
           <w:bCs w:val="0"/>
         </w:rPr>
-        <w:t xml:space="preserve">If you are right  </w:t>
+        <w:t>If you are wrong it will tell you and you can try another button.</w:t>
+      </w:r>
+    </w:p>
+    <w:p>
+      <w:pPr>
+        <w:pStyle w:val="Style1"/>
+        <w:numPr>
+          <w:ilvl w:val="3"/>
+          <w:numId w:val="2"/>
+        </w:numPr>
+        <w:rPr>
+          <w:b w:val="0"/>
+          <w:bCs w:val="0"/>
+        </w:rPr>
+      </w:pPr>
+      <w:r>
+        <w:rPr>
+          <w:b w:val="0"/>
+          <w:bCs w:val="0"/>
+        </w:rPr>
+        <w:t>If you are right  it will tell you and draw the notes on the staff</w:t>
+      </w:r>
+      <w:r>
+        <w:rPr>
+          <w:b w:val="0"/>
+          <w:bCs w:val="0"/>
+        </w:rPr>
+        <w:t>, transposed to the key of he selected instrument.</w:t>
+      </w:r>
+    </w:p>
+    <w:p>
+      <w:pPr>
+        <w:pStyle w:val="Style1"/>
+        <w:numPr>
+          <w:ilvl w:val="3"/>
+          <w:numId w:val="2"/>
+        </w:numPr>
+        <w:rPr>
+          <w:b w:val="0"/>
+          <w:bCs w:val="0"/>
+        </w:rPr>
+      </w:pPr>
+      <w:r>
+        <w:rPr>
+          <w:b w:val="0"/>
+          <w:bCs w:val="0"/>
+        </w:rPr>
+        <w:t>If you then keep on tapping interval buttons it will sound the interval and show it on the staff. It will keep on using the same first note, even if  if it was initially chosen as random.</w:t>
+      </w:r>
+    </w:p>
+    <w:p>
+      <w:pPr>
+        <w:pStyle w:val="Style1"/>
+        <w:numPr>
+          <w:ilvl w:val="2"/>
+          <w:numId w:val="2"/>
+        </w:numPr>
+        <w:rPr>
+          <w:b w:val="0"/>
+          <w:bCs w:val="0"/>
+        </w:rPr>
+      </w:pPr>
+      <w:r>
+        <w:t>Feature:</w:t>
+      </w:r>
+      <w:r>
+        <w:rPr>
+          <w:b w:val="0"/>
+          <w:bCs w:val="0"/>
+        </w:rPr>
+        <w:t xml:space="preserve"> Interval Sight Training – On this page you can</w:t>
+      </w:r>
+    </w:p>
+    <w:p>
+      <w:pPr>
+        <w:pStyle w:val="Style1"/>
+        <w:numPr>
+          <w:ilvl w:val="3"/>
+          <w:numId w:val="2"/>
+        </w:numPr>
+        <w:rPr>
+          <w:b w:val="0"/>
+          <w:bCs w:val="0"/>
+        </w:rPr>
+      </w:pPr>
+      <w:r>
+        <w:rPr>
+          <w:b w:val="0"/>
+          <w:bCs w:val="0"/>
+        </w:rPr>
+        <w:t xml:space="preserve">Set the level </w:t>
+      </w:r>
+    </w:p>
+    <w:p>
+      <w:pPr>
+        <w:pStyle w:val="Style1"/>
+        <w:numPr>
+          <w:ilvl w:val="4"/>
+          <w:numId w:val="2"/>
+        </w:numPr>
+        <w:rPr>
+          <w:b w:val="0"/>
+          <w:bCs w:val="0"/>
+        </w:rPr>
+      </w:pPr>
+      <w:r>
+        <w:rPr>
+          <w:b w:val="0"/>
+          <w:bCs w:val="0"/>
+        </w:rPr>
+        <w:t>Not the same as the level used for music</w:t>
+      </w:r>
+    </w:p>
+    <w:p>
+      <w:pPr>
+        <w:pStyle w:val="Style1"/>
+        <w:numPr>
+          <w:ilvl w:val="4"/>
+          <w:numId w:val="2"/>
+        </w:numPr>
+        <w:rPr>
+          <w:b w:val="0"/>
+          <w:bCs w:val="0"/>
+        </w:rPr>
+      </w:pPr>
+      <w:r>
+        <w:rPr>
+          <w:b w:val="0"/>
+          <w:bCs w:val="0"/>
+        </w:rPr>
+        <w:t>From 1 to 100</w:t>
+      </w:r>
+    </w:p>
+    <w:p>
+      <w:pPr>
+        <w:pStyle w:val="Style1"/>
+        <w:numPr>
+          <w:ilvl w:val="4"/>
+          <w:numId w:val="2"/>
+        </w:numPr>
+        <w:rPr>
+          <w:b w:val="0"/>
+          <w:bCs w:val="0"/>
+        </w:rPr>
+      </w:pPr>
+      <w:r>
+        <w:rPr>
+          <w:b w:val="0"/>
+          <w:bCs w:val="0"/>
+        </w:rPr>
+        <w:t>Higher lower levels give smaller maximum intervals.</w:t>
+      </w:r>
+    </w:p>
+    <w:p>
+      <w:pPr>
+        <w:pStyle w:val="Style1"/>
+        <w:numPr>
+          <w:ilvl w:val="3"/>
+          <w:numId w:val="2"/>
+        </w:numPr>
+        <w:rPr>
+          <w:b w:val="0"/>
+          <w:bCs w:val="0"/>
+        </w:rPr>
+      </w:pPr>
+      <w:r>
+        <w:rPr>
+          <w:b w:val="0"/>
+          <w:bCs w:val="0"/>
+        </w:rPr>
+        <w:t>See a set of notes on a staff in the key of C major.</w:t>
+      </w:r>
+    </w:p>
+    <w:p>
+      <w:pPr>
+        <w:pStyle w:val="Style1"/>
+        <w:numPr>
+          <w:ilvl w:val="3"/>
+          <w:numId w:val="2"/>
+        </w:numPr>
+        <w:rPr>
+          <w:b w:val="0"/>
+          <w:bCs w:val="0"/>
+        </w:rPr>
+      </w:pPr>
+      <w:r>
+        <w:rPr>
+          <w:b w:val="0"/>
+          <w:bCs w:val="0"/>
+        </w:rPr>
+        <w:t>Note that two of the notes are yellow – this is the interval.</w:t>
+      </w:r>
+    </w:p>
+    <w:p>
+      <w:pPr>
+        <w:pStyle w:val="Style1"/>
+        <w:numPr>
+          <w:ilvl w:val="3"/>
+          <w:numId w:val="2"/>
+        </w:numPr>
+        <w:rPr>
+          <w:b w:val="0"/>
+          <w:bCs w:val="0"/>
+        </w:rPr>
+      </w:pPr>
+      <w:r>
+        <w:rPr>
+          <w:b w:val="0"/>
+          <w:bCs w:val="0"/>
+        </w:rPr>
+        <w:t>Choose what the interval is by tapping a button.</w:t>
+      </w:r>
+    </w:p>
+    <w:p>
+      <w:pPr>
+        <w:pStyle w:val="Style1"/>
+        <w:numPr>
+          <w:ilvl w:val="3"/>
+          <w:numId w:val="2"/>
+        </w:numPr>
+        <w:rPr>
+          <w:b w:val="0"/>
+          <w:bCs w:val="0"/>
+        </w:rPr>
+      </w:pPr>
+      <w:r>
+        <w:rPr>
+          <w:b w:val="0"/>
+          <w:bCs w:val="0"/>
+        </w:rPr>
+        <w:t>If you are wrong the notes will turn red and you can try again.</w:t>
+      </w:r>
+    </w:p>
+    <w:p>
+      <w:pPr>
+        <w:pStyle w:val="Style1"/>
+        <w:numPr>
+          <w:ilvl w:val="3"/>
+          <w:numId w:val="2"/>
+        </w:numPr>
+        <w:rPr>
+          <w:b w:val="0"/>
+          <w:bCs w:val="0"/>
+        </w:rPr>
+      </w:pPr>
+      <w:r>
+        <w:rPr>
+          <w:b w:val="0"/>
+          <w:bCs w:val="0"/>
+        </w:rPr>
+        <w:t>If you are right the colors will change so that a new interval is defined by the next pair of notes.</w:t>
+      </w:r>
+    </w:p>
+    <w:p>
+      <w:pPr>
+        <w:pStyle w:val="Style1"/>
+        <w:numPr>
+          <w:ilvl w:val="3"/>
+          <w:numId w:val="2"/>
+        </w:numPr>
+        <w:rPr>
+          <w:b w:val="0"/>
+          <w:bCs w:val="0"/>
+        </w:rPr>
+      </w:pPr>
+      <w:r>
+        <w:rPr>
+          <w:b w:val="0"/>
+          <w:bCs w:val="0"/>
+        </w:rPr>
+        <w:t>When you have done the last interval tap New to start a new row of notes.</w:t>
+      </w:r>
+    </w:p>
+    <w:p>
+      <w:pPr>
+        <w:pStyle w:val="Style1"/>
+        <w:numPr>
+          <w:ilvl w:val="3"/>
+          <w:numId w:val="2"/>
+        </w:numPr>
+        <w:rPr>
+          <w:b w:val="0"/>
+          <w:bCs w:val="0"/>
+        </w:rPr>
+      </w:pPr>
+      <w:r>
+        <w:rPr>
+          <w:b w:val="0"/>
+          <w:bCs w:val="0"/>
+        </w:rPr>
+        <w:t>The key signature will be chosen at random and is independent of that on the Music page.</w:t>
+      </w:r>
+    </w:p>
+    <w:p>
+      <w:pPr>
+        <w:pStyle w:val="Style1"/>
+        <w:numPr>
+          <w:ilvl w:val="3"/>
+          <w:numId w:val="2"/>
+        </w:numPr>
+        <w:rPr>
+          <w:b w:val="0"/>
+          <w:bCs w:val="0"/>
+        </w:rPr>
+      </w:pPr>
+      <w:r>
+        <w:rPr>
+          <w:b w:val="0"/>
+          <w:bCs w:val="0"/>
+        </w:rPr>
+        <w:t>Key signatures will have more sharps or flats the higher the level.</w:t>
+      </w:r>
+    </w:p>
+    <w:p>
+      <w:pPr>
+        <w:pStyle w:val="Style1"/>
+        <w:numPr>
+          <w:ilvl w:val="2"/>
+          <w:numId w:val="2"/>
+        </w:numPr>
+        <w:rPr>
+          <w:b w:val="0"/>
+          <w:bCs w:val="0"/>
+        </w:rPr>
+      </w:pPr>
+      <w:r>
+        <w:t xml:space="preserve">Feature: </w:t>
+      </w:r>
+      <w:r>
+        <w:rPr>
+          <w:b w:val="0"/>
+          <w:bCs w:val="0"/>
+        </w:rPr>
+        <w:t>Interval Singing Training – on this page you can:</w:t>
+      </w:r>
+    </w:p>
+    <w:p>
+      <w:pPr>
+        <w:pStyle w:val="Style1"/>
+        <w:numPr>
+          <w:ilvl w:val="3"/>
+          <w:numId w:val="2"/>
+        </w:numPr>
+        <w:rPr>
+          <w:b w:val="0"/>
+          <w:bCs w:val="0"/>
+        </w:rPr>
+      </w:pPr>
+      <w:r>
+        <w:rPr>
+          <w:b w:val="0"/>
+          <w:bCs w:val="0"/>
+        </w:rPr>
+        <w:t>Pick a start note (the first note in the interval) – it can be random.</w:t>
+      </w:r>
+    </w:p>
+    <w:p>
+      <w:pPr>
+        <w:pStyle w:val="Style1"/>
+        <w:numPr>
+          <w:ilvl w:val="3"/>
+          <w:numId w:val="2"/>
+        </w:numPr>
+        <w:rPr>
+          <w:b w:val="0"/>
+          <w:bCs w:val="0"/>
+        </w:rPr>
+      </w:pPr>
+      <w:r>
+        <w:rPr>
+          <w:b w:val="0"/>
+          <w:bCs w:val="0"/>
+        </w:rPr>
+        <w:t>Pick a Mode</w:t>
+      </w:r>
+    </w:p>
+    <w:p>
+      <w:pPr>
+        <w:pStyle w:val="Style1"/>
+        <w:numPr>
+          <w:ilvl w:val="4"/>
+          <w:numId w:val="2"/>
+        </w:numPr>
+        <w:rPr>
+          <w:b w:val="0"/>
+          <w:bCs w:val="0"/>
+        </w:rPr>
+      </w:pPr>
+      <w:r>
+        <w:rPr>
+          <w:b w:val="0"/>
+          <w:bCs w:val="0"/>
+        </w:rPr>
+        <w:t>Sing Interval</w:t>
+      </w:r>
+    </w:p>
+    <w:p>
+      <w:pPr>
+        <w:pStyle w:val="Style1"/>
+        <w:numPr>
+          <w:ilvl w:val="5"/>
+          <w:numId w:val="2"/>
+        </w:numPr>
+        <w:rPr>
+          <w:b w:val="0"/>
+          <w:bCs w:val="0"/>
+        </w:rPr>
+      </w:pPr>
+      <w:r>
+        <w:rPr>
+          <w:b w:val="0"/>
+          <w:bCs w:val="0"/>
+        </w:rPr>
+        <w:t>Click New to hear the first note</w:t>
+      </w:r>
+    </w:p>
+    <w:p>
+      <w:pPr>
+        <w:pStyle w:val="Style1"/>
+        <w:numPr>
+          <w:ilvl w:val="5"/>
+          <w:numId w:val="2"/>
+        </w:numPr>
+        <w:rPr>
+          <w:b w:val="0"/>
+          <w:bCs w:val="0"/>
+        </w:rPr>
+      </w:pPr>
+      <w:r>
+        <w:rPr>
+          <w:b w:val="0"/>
+          <w:bCs w:val="0"/>
+        </w:rPr>
+        <w:t>Sing the interval that is shown in words  e.g Major third upwards.</w:t>
+      </w:r>
+    </w:p>
+    <w:p>
+      <w:pPr>
+        <w:pStyle w:val="Style1"/>
+        <w:numPr>
+          <w:ilvl w:val="5"/>
+          <w:numId w:val="2"/>
+        </w:numPr>
+        <w:rPr>
+          <w:b w:val="0"/>
+          <w:bCs w:val="0"/>
+        </w:rPr>
+      </w:pPr>
+      <w:r>
+        <w:rPr>
+          <w:b w:val="0"/>
+          <w:bCs w:val="0"/>
+        </w:rPr>
+        <w:t>Sing the note</w:t>
+      </w:r>
+    </w:p>
+    <w:p>
+      <w:pPr>
+        <w:pStyle w:val="Style1"/>
+        <w:numPr>
+          <w:ilvl w:val="5"/>
+          <w:numId w:val="2"/>
+        </w:numPr>
+        <w:rPr>
+          <w:b w:val="0"/>
+          <w:bCs w:val="0"/>
+        </w:rPr>
+      </w:pPr>
+      <w:r>
+        <w:rPr>
+          <w:b w:val="0"/>
+          <w:bCs w:val="0"/>
+        </w:rPr>
+        <w:t>If you are wrong it will tell you if you were too high or two low and you can sing again.</w:t>
+      </w:r>
+    </w:p>
+    <w:p>
+      <w:pPr>
+        <w:pStyle w:val="Style1"/>
+        <w:numPr>
+          <w:ilvl w:val="5"/>
+          <w:numId w:val="2"/>
+        </w:numPr>
+        <w:rPr>
+          <w:b w:val="0"/>
+          <w:bCs w:val="0"/>
+        </w:rPr>
+      </w:pPr>
+      <w:r>
+        <w:rPr>
+          <w:b w:val="0"/>
+          <w:bCs w:val="0"/>
+        </w:rPr>
+        <w:t>If you are right it will tell you and show the interval on the staff</w:t>
+      </w:r>
+      <w:r>
+        <w:rPr>
+          <w:b w:val="0"/>
+          <w:bCs w:val="0"/>
+        </w:rPr>
+        <w:t>.</w:t>
+      </w:r>
+    </w:p>
+    <w:p>
+      <w:pPr>
+        <w:pStyle w:val="Style1"/>
+        <w:numPr>
+          <w:ilvl w:val="5"/>
+          <w:numId w:val="2"/>
+        </w:numPr>
+        <w:rPr>
+          <w:b w:val="0"/>
+          <w:bCs w:val="0"/>
+        </w:rPr>
+      </w:pPr>
+      <w:r>
+        <w:rPr>
+          <w:b w:val="0"/>
+          <w:bCs w:val="0"/>
+        </w:rPr>
+        <w:t>If you are wrong it will tell you you are too high or too low and you can try again.</w:t>
+      </w:r>
+    </w:p>
+    <w:p>
+      <w:pPr>
+        <w:pStyle w:val="Style1"/>
+        <w:numPr>
+          <w:ilvl w:val="4"/>
+          <w:numId w:val="2"/>
+        </w:numPr>
+        <w:rPr>
+          <w:b w:val="0"/>
+          <w:bCs w:val="0"/>
+        </w:rPr>
+      </w:pPr>
+      <w:r>
+        <w:rPr>
+          <w:b w:val="0"/>
+          <w:bCs w:val="0"/>
+        </w:rPr>
+        <w:t>Imitate Interva</w:t>
+      </w:r>
+      <w:r>
+        <w:rPr>
+          <w:b w:val="0"/>
+          <w:bCs w:val="0"/>
+        </w:rPr>
+        <w:t>l</w:t>
+      </w:r>
+    </w:p>
+    <w:p>
+      <w:pPr>
+        <w:pStyle w:val="Style1"/>
+        <w:numPr>
+          <w:ilvl w:val="5"/>
+          <w:numId w:val="2"/>
+        </w:numPr>
+        <w:rPr>
+          <w:b w:val="0"/>
+          <w:bCs w:val="0"/>
+        </w:rPr>
+      </w:pPr>
+      <w:r>
+        <w:rPr>
+          <w:b w:val="0"/>
+          <w:bCs w:val="0"/>
+        </w:rPr>
+        <w:t>Click New to hear both notes of the interval.</w:t>
+      </w:r>
+    </w:p>
+    <w:p>
+      <w:pPr>
+        <w:pStyle w:val="Style1"/>
+        <w:numPr>
+          <w:ilvl w:val="5"/>
+          <w:numId w:val="2"/>
+        </w:numPr>
+        <w:rPr>
+          <w:b w:val="0"/>
+          <w:bCs w:val="0"/>
+        </w:rPr>
+      </w:pPr>
+      <w:r>
+        <w:rPr>
+          <w:b w:val="0"/>
+          <w:bCs w:val="0"/>
+        </w:rPr>
+        <w:t>Try to sing the same notes.</w:t>
+      </w:r>
+    </w:p>
+    <w:p>
+      <w:pPr>
+        <w:pStyle w:val="Style1"/>
+        <w:numPr>
+          <w:ilvl w:val="5"/>
+          <w:numId w:val="2"/>
+        </w:numPr>
+        <w:rPr>
+          <w:b w:val="0"/>
+          <w:bCs w:val="0"/>
+        </w:rPr>
+      </w:pPr>
+      <w:r>
+        <w:rPr>
+          <w:b w:val="0"/>
+          <w:bCs w:val="0"/>
+        </w:rPr>
+        <w:t>If you are wrong it will tell you which of the notes was too high or two low and you may try again.</w:t>
+      </w:r>
+    </w:p>
+    <w:p>
+      <w:pPr>
+        <w:pStyle w:val="Style1"/>
+        <w:numPr>
+          <w:ilvl w:val="5"/>
+          <w:numId w:val="2"/>
+        </w:numPr>
+        <w:rPr>
+          <w:b w:val="0"/>
+          <w:bCs w:val="0"/>
+        </w:rPr>
+      </w:pPr>
+      <w:r>
+        <w:rPr>
+          <w:b w:val="0"/>
+          <w:bCs w:val="0"/>
+        </w:rPr>
+        <w:t>If both notes are correct it will tell you.</w:t>
+      </w:r>
+    </w:p>
+    <w:p>
+      <w:pPr>
+        <w:pStyle w:val="Style1"/>
+        <w:numPr>
+          <w:ilvl w:val="4"/>
+          <w:numId w:val="2"/>
+        </w:numPr>
+        <w:rPr>
+          <w:b w:val="0"/>
+          <w:bCs w:val="0"/>
+        </w:rPr>
+      </w:pPr>
+      <w:r>
+        <w:rPr>
+          <w:b w:val="0"/>
+          <w:bCs w:val="0"/>
+        </w:rPr>
+        <w:t>Hear and Identify the interval</w:t>
+      </w:r>
+    </w:p>
+    <w:p>
+      <w:pPr>
+        <w:pStyle w:val="Style1"/>
+        <w:numPr>
+          <w:ilvl w:val="5"/>
+          <w:numId w:val="2"/>
+        </w:numPr>
+        <w:rPr>
+          <w:b w:val="0"/>
+          <w:bCs w:val="0"/>
+        </w:rPr>
+      </w:pPr>
+      <w:r>
+        <w:rPr>
+          <w:b w:val="0"/>
+          <w:bCs w:val="0"/>
+        </w:rPr>
+        <w:t>Tap new to hear both notes of the interval.</w:t>
+      </w:r>
+    </w:p>
+    <w:p>
+      <w:pPr>
+        <w:pStyle w:val="Style1"/>
+        <w:numPr>
+          <w:ilvl w:val="5"/>
+          <w:numId w:val="2"/>
+        </w:numPr>
+        <w:rPr>
+          <w:b w:val="0"/>
+          <w:bCs w:val="0"/>
+        </w:rPr>
+      </w:pPr>
+      <w:r>
+        <w:rPr>
+          <w:b w:val="0"/>
+          <w:bCs w:val="0"/>
+        </w:rPr>
+        <w:t>Tap the button for the interval you think it was.</w:t>
+      </w:r>
+    </w:p>
+    <w:p>
+      <w:pPr>
+        <w:pStyle w:val="Style1"/>
+        <w:numPr>
+          <w:ilvl w:val="5"/>
+          <w:numId w:val="2"/>
+        </w:numPr>
+        <w:rPr>
+          <w:b w:val="0"/>
+          <w:bCs w:val="0"/>
+        </w:rPr>
+      </w:pPr>
+      <w:r>
+        <w:rPr>
+          <w:b w:val="0"/>
+          <w:bCs w:val="0"/>
+        </w:rPr>
+        <w:t>If you are wrong the button will temporarilly go red..</w:t>
+      </w:r>
+    </w:p>
+    <w:p>
+      <w:pPr>
+        <w:pStyle w:val="Style1"/>
+        <w:numPr>
+          <w:ilvl w:val="5"/>
+          <w:numId w:val="2"/>
+        </w:numPr>
+        <w:rPr>
+          <w:b w:val="0"/>
+          <w:bCs w:val="0"/>
+        </w:rPr>
+      </w:pPr>
+      <w:r>
+        <w:rPr>
+          <w:b w:val="0"/>
+          <w:bCs w:val="0"/>
+        </w:rPr>
+        <w:t>If you are right the button will temporarilly go green and it will show the interval on he staff.</w:t>
+      </w:r>
+    </w:p>
+    <w:p>
+      <w:pPr>
+        <w:pStyle w:val="Style1"/>
+        <w:numPr>
+          <w:ilvl w:val="3"/>
+          <w:numId w:val="2"/>
+        </w:numPr>
+        <w:rPr>
+          <w:b w:val="0"/>
+          <w:bCs w:val="0"/>
+        </w:rPr>
+      </w:pPr>
+      <w:r>
+        <w:rPr>
+          <w:b w:val="0"/>
+          <w:bCs w:val="0"/>
+        </w:rPr>
+        <w:t xml:space="preserve">To hear </w:t>
+      </w:r>
+      <w:r>
+        <w:rPr>
+          <w:b w:val="0"/>
+          <w:bCs w:val="0"/>
+        </w:rPr>
+        <w:t xml:space="preserve">the interval </w:t>
+      </w:r>
+      <w:r>
+        <w:rPr>
+          <w:b w:val="0"/>
+          <w:bCs w:val="0"/>
+        </w:rPr>
+        <w:t xml:space="preserve"> again tap Hear.</w:t>
+      </w:r>
+    </w:p>
+    <w:p>
+      <w:pPr>
+        <w:pStyle w:val="Style1"/>
+        <w:numPr>
+          <w:ilvl w:val="3"/>
+          <w:numId w:val="2"/>
+        </w:numPr>
+        <w:rPr>
+          <w:b w:val="0"/>
+          <w:bCs w:val="0"/>
+        </w:rPr>
+      </w:pPr>
+      <w:r>
+        <w:rPr>
+          <w:b w:val="0"/>
+          <w:bCs w:val="0"/>
+        </w:rPr>
+        <w:t>Tap Reveal to show the interval on the staff.</w:t>
       </w:r>
     </w:p>
     <w:sectPr>
@@ -1253,7 +2052,7 @@
         <w:ind w:left="2880" w:hanging="360"/>
       </w:pPr>
     </w:lvl>
-    <w:lvl w:ilvl="4" w:tplc="04090019" w:tentative="1">
+    <w:lvl w:ilvl="4" w:tplc="04090019">
       <w:start w:val="1"/>
       <w:numFmt w:val="lowerLetter"/>
       <w:lvlText w:val="%5."/>
@@ -1262,7 +2061,7 @@
         <w:ind w:left="3600" w:hanging="360"/>
       </w:pPr>
     </w:lvl>
-    <w:lvl w:ilvl="5" w:tplc="0409001B" w:tentative="1">
+    <w:lvl w:ilvl="5" w:tplc="0409001B">
       <w:start w:val="1"/>
       <w:numFmt w:val="lowerRoman"/>
       <w:lvlText w:val="%6."/>

</xml_diff>

<commit_message>
After several debugging runs
</commit_message>
<xml_diff>
--- a/Docs/Acknowledgements.docx
+++ b/Docs/Acknowledgements.docx
@@ -265,6 +265,49 @@
     </w:p>
     <w:p>
       <w:pPr>
+        <w:pStyle w:val="ListParagraph"/>
+        <w:numPr>
+          <w:ilvl w:val="1"/>
+          <w:numId w:val="2"/>
+        </w:numPr>
+      </w:pPr>
+      <w:r>
+        <w:rPr>
+          <w:b/>
+          <w:bCs/>
+        </w:rPr>
+        <w:t>Comment</w:t>
+      </w:r>
+      <w:r>
+        <w:t xml:space="preserve">: </w:t>
+      </w:r>
+      <w:r>
+        <w:t>There should be a key signature on the lower staff</w:t>
+      </w:r>
+    </w:p>
+    <w:p>
+      <w:pPr>
+        <w:pStyle w:val="ListParagraph"/>
+        <w:numPr>
+          <w:ilvl w:val="2"/>
+          <w:numId w:val="2"/>
+        </w:numPr>
+      </w:pPr>
+      <w:r>
+        <w:rPr>
+          <w:rStyle w:val="Style1Char"/>
+        </w:rPr>
+        <w:t>Feature</w:t>
+      </w:r>
+      <w:r>
+        <w:t xml:space="preserve">: </w:t>
+      </w:r>
+      <w:r>
+        <w:t>Settings switch: Show key and time signatures on both staffs.</w:t>
+      </w:r>
+    </w:p>
+    <w:p>
+      <w:pPr>
         <w:pStyle w:val="Commenter"/>
       </w:pPr>
       <w:r>
@@ -336,39 +379,36 @@
         <w:t>Comment</w:t>
       </w:r>
       <w:r>
-        <w:t>:</w:t>
+        <w:t xml:space="preserve">: </w:t>
+      </w:r>
+      <w:r>
+        <w:t xml:space="preserve">Could there also be a </w:t>
+      </w:r>
+      <w:r>
+        <w:t>tuning</w:t>
+      </w:r>
+      <w:r>
+        <w:t xml:space="preserve"> fork type option to tune so instead of the app listening, it will play a pitch that can be tuned to?</w:t>
+      </w:r>
+    </w:p>
+    <w:p>
+      <w:pPr>
+        <w:pStyle w:val="ListParagraph"/>
+        <w:numPr>
+          <w:ilvl w:val="2"/>
+          <w:numId w:val="2"/>
+        </w:numPr>
+      </w:pPr>
+      <w:r>
+        <w:rPr>
+          <w:rStyle w:val="Style1Char"/>
+        </w:rPr>
+        <w:t>Feature:</w:t>
       </w:r>
       <w:r>
         <w:t xml:space="preserve"> </w:t>
       </w:r>
       <w:r>
-        <w:t xml:space="preserve">Could there also be a </w:t>
-      </w:r>
-      <w:r>
-        <w:t>tuning</w:t>
-      </w:r>
-      <w:r>
-        <w:t xml:space="preserve"> fork type option to tune so instead of the app listening, it will play a pitch that can be tuned to?</w:t>
-      </w:r>
-    </w:p>
-    <w:p>
-      <w:pPr>
-        <w:pStyle w:val="ListParagraph"/>
-        <w:numPr>
-          <w:ilvl w:val="2"/>
-          <w:numId w:val="2"/>
-        </w:numPr>
-      </w:pPr>
-      <w:r>
-        <w:rPr>
-          <w:rStyle w:val="Style1Char"/>
-        </w:rPr>
-        <w:t>Feature:</w:t>
-      </w:r>
-      <w:r>
-        <w:t xml:space="preserve"> </w:t>
-      </w:r>
-      <w:r>
         <w:t xml:space="preserve">Tuner  / </w:t>
       </w:r>
       <w:r>
@@ -402,6 +442,7 @@
         </w:rPr>
       </w:pPr>
       <w:r>
+        <w:lastRenderedPageBreak/>
         <w:t>Comment</w:t>
       </w:r>
       <w:r>
@@ -790,7 +831,41 @@
           <w:b w:val="0"/>
           <w:bCs w:val="0"/>
         </w:rPr>
-        <w:t>Select ascending or desce</w:t>
+        <w:t>Select the key into which the notes of the interval will  be transposed for display on the staff.</w:t>
+      </w:r>
+    </w:p>
+    <w:p>
+      <w:pPr>
+        <w:pStyle w:val="Style1"/>
+        <w:numPr>
+          <w:ilvl w:val="3"/>
+          <w:numId w:val="2"/>
+        </w:numPr>
+        <w:rPr>
+          <w:b w:val="0"/>
+          <w:bCs w:val="0"/>
+        </w:rPr>
+      </w:pPr>
+      <w:r>
+        <w:rPr>
+          <w:b w:val="0"/>
+          <w:bCs w:val="0"/>
+        </w:rPr>
+        <w:t xml:space="preserve">Select ascending </w:t>
+      </w:r>
+      <w:r>
+        <w:rPr>
+          <w:b w:val="0"/>
+          <w:bCs w:val="0"/>
+        </w:rPr>
+        <w:t xml:space="preserve">, </w:t>
+      </w:r>
+      <w:r>
+        <w:rPr>
+          <w:b w:val="0"/>
+          <w:bCs w:val="0"/>
+        </w:rPr>
+        <w:t xml:space="preserve"> desce</w:t>
       </w:r>
       <w:r>
         <w:rPr>
@@ -806,6 +881,13 @@
         </w:rPr>
         <w:t>ding</w:t>
       </w:r>
+      <w:r>
+        <w:rPr>
+          <w:b w:val="0"/>
+          <w:bCs w:val="0"/>
+        </w:rPr>
+        <w:t xml:space="preserve"> or random direction.</w:t>
+      </w:r>
     </w:p>
     <w:p>
       <w:pPr>
@@ -824,6 +906,26 @@
           <w:b w:val="0"/>
           <w:bCs w:val="0"/>
         </w:rPr>
+        <w:t>Set the duration of the note in milliseconds. The corresponding tempo for repeated notes of this duration is shown in beats per miinute.</w:t>
+      </w:r>
+    </w:p>
+    <w:p>
+      <w:pPr>
+        <w:pStyle w:val="Style1"/>
+        <w:numPr>
+          <w:ilvl w:val="3"/>
+          <w:numId w:val="2"/>
+        </w:numPr>
+        <w:rPr>
+          <w:b w:val="0"/>
+          <w:bCs w:val="0"/>
+        </w:rPr>
+      </w:pPr>
+      <w:r>
+        <w:rPr>
+          <w:b w:val="0"/>
+          <w:bCs w:val="0"/>
+        </w:rPr>
         <w:t>Play an interval with a random second note.</w:t>
       </w:r>
     </w:p>
@@ -844,6 +946,7 @@
           <w:b w:val="0"/>
           <w:bCs w:val="0"/>
         </w:rPr>
+        <w:lastRenderedPageBreak/>
         <w:t>OR play the previous interval again</w:t>
       </w:r>
     </w:p>
@@ -922,14 +1025,7 @@
           <w:b w:val="0"/>
           <w:bCs w:val="0"/>
         </w:rPr>
-        <w:t>If you are right  it will tell you and draw the notes on the staff</w:t>
-      </w:r>
-      <w:r>
-        <w:rPr>
-          <w:b w:val="0"/>
-          <w:bCs w:val="0"/>
-        </w:rPr>
-        <w:t>, transposed to the key of he selected instrument.</w:t>
+        <w:t>If you are right  it will tell you and draw the notes on the staff, transposed to the key of he selected instrument.</w:t>
       </w:r>
     </w:p>
     <w:p>
@@ -974,6 +1070,13 @@
         </w:rPr>
         <w:t xml:space="preserve"> Interval Sight Training – On this page you can</w:t>
       </w:r>
+      <w:r>
+        <w:rPr>
+          <w:b w:val="0"/>
+          <w:bCs w:val="0"/>
+        </w:rPr>
+        <w:t>:</w:t>
+      </w:r>
     </w:p>
     <w:p>
       <w:pPr>
@@ -1052,7 +1155,14 @@
           <w:b w:val="0"/>
           <w:bCs w:val="0"/>
         </w:rPr>
-        <w:t>Higher lower levels give smaller maximum intervals.</w:t>
+        <w:t>L</w:t>
+      </w:r>
+      <w:r>
+        <w:rPr>
+          <w:b w:val="0"/>
+          <w:bCs w:val="0"/>
+        </w:rPr>
+        <w:t>ower levels give smaller maximum intervals.</w:t>
       </w:r>
     </w:p>
     <w:p>
@@ -1152,7 +1262,21 @@
           <w:b w:val="0"/>
           <w:bCs w:val="0"/>
         </w:rPr>
-        <w:t>If you are right the colors will change so that a new interval is defined by the next pair of notes.</w:t>
+        <w:t>If you are right the colors will change so that a new interval is defined by the next pair of notes</w:t>
+      </w:r>
+      <w:r>
+        <w:rPr>
+          <w:b w:val="0"/>
+          <w:bCs w:val="0"/>
+        </w:rPr>
+        <w:t xml:space="preserve"> which are now yellow</w:t>
+      </w:r>
+      <w:r>
+        <w:rPr>
+          <w:b w:val="0"/>
+          <w:bCs w:val="0"/>
+        </w:rPr>
+        <w:t>.</w:t>
       </w:r>
     </w:p>
     <w:p>
@@ -1422,6 +1546,7 @@
           <w:b w:val="0"/>
           <w:bCs w:val="0"/>
         </w:rPr>
+        <w:lastRenderedPageBreak/>
         <w:t>If you are wrong it will tell you you are too high or too low and you can try again.</w:t>
       </w:r>
     </w:p>
@@ -1649,21 +1774,7 @@
           <w:b w:val="0"/>
           <w:bCs w:val="0"/>
         </w:rPr>
-        <w:t xml:space="preserve">To hear </w:t>
-      </w:r>
-      <w:r>
-        <w:rPr>
-          <w:b w:val="0"/>
-          <w:bCs w:val="0"/>
-        </w:rPr>
-        <w:t xml:space="preserve">the interval </w:t>
-      </w:r>
-      <w:r>
-        <w:rPr>
-          <w:b w:val="0"/>
-          <w:bCs w:val="0"/>
-        </w:rPr>
-        <w:t xml:space="preserve"> again tap Hear.</w:t>
+        <w:t>To hear the interval  again tap Hear.</w:t>
       </w:r>
     </w:p>
     <w:p>
@@ -3064,6 +3175,7 @@
   <w:style w:type="character" w:default="1" w:styleId="DefaultParagraphFont">
     <w:name w:val="Default Paragraph Font"/>
     <w:uiPriority w:val="1"/>
+    <w:semiHidden/>
     <w:unhideWhenUsed/>
   </w:style>
   <w:style w:type="table" w:default="1" w:styleId="TableNormal">

</xml_diff>